<commit_message>
Add screenshots - S2025101808 Hanz Andrei Magnaye
</commit_message>
<xml_diff>
--- a/Screenshots/S2025101808_HanzAndreiMagnaye/S2025101808_HanzAndreiMagnaye.docx
+++ b/Screenshots/S2025101808_HanzAndreiMagnaye/S2025101808_HanzAndreiMagnaye.docx
@@ -68,7 +68,7 @@
                     <pic:cNvPicPr/>
                   </pic:nvPicPr>
                   <pic:blipFill>
-                    <a:blip r:embed="rId4"/>
+                    <a:blip r:embed="rId5"/>
                     <a:stretch>
                       <a:fillRect/>
                     </a:stretch>
@@ -120,7 +120,7 @@
                     <pic:cNvPicPr/>
                   </pic:nvPicPr>
                   <pic:blipFill>
-                    <a:blip r:embed="rId5"/>
+                    <a:blip r:embed="rId6"/>
                     <a:stretch>
                       <a:fillRect/>
                     </a:stretch>
@@ -193,7 +193,7 @@
                     <pic:cNvPicPr/>
                   </pic:nvPicPr>
                   <pic:blipFill>
-                    <a:blip r:embed="rId6"/>
+                    <a:blip r:embed="rId7"/>
                     <a:stretch>
                       <a:fillRect/>
                     </a:stretch>
@@ -273,7 +273,7 @@
                     <pic:cNvPicPr/>
                   </pic:nvPicPr>
                   <pic:blipFill>
-                    <a:blip r:embed="rId7"/>
+                    <a:blip r:embed="rId8"/>
                     <a:stretch>
                       <a:fillRect/>
                     </a:stretch>
@@ -379,7 +379,7 @@
                     <pic:cNvPicPr/>
                   </pic:nvPicPr>
                   <pic:blipFill>
-                    <a:blip r:embed="rId8"/>
+                    <a:blip r:embed="rId9"/>
                     <a:stretch>
                       <a:fillRect/>
                     </a:stretch>
@@ -461,7 +461,7 @@
                     <pic:cNvPicPr/>
                   </pic:nvPicPr>
                   <pic:blipFill>
-                    <a:blip r:embed="rId9"/>
+                    <a:blip r:embed="rId10"/>
                     <a:stretch>
                       <a:fillRect/>
                     </a:stretch>
@@ -525,7 +525,7 @@
                     <pic:cNvPicPr/>
                   </pic:nvPicPr>
                   <pic:blipFill>
-                    <a:blip r:embed="rId10"/>
+                    <a:blip r:embed="rId11"/>
                     <a:stretch>
                       <a:fillRect/>
                     </a:stretch>
@@ -605,7 +605,7 @@
                     <pic:cNvPicPr/>
                   </pic:nvPicPr>
                   <pic:blipFill>
-                    <a:blip r:embed="rId11"/>
+                    <a:blip r:embed="rId12"/>
                     <a:stretch>
                       <a:fillRect/>
                     </a:stretch>
@@ -671,7 +671,7 @@
                     <pic:cNvPicPr/>
                   </pic:nvPicPr>
                   <pic:blipFill>
-                    <a:blip r:embed="rId12"/>
+                    <a:blip r:embed="rId13"/>
                     <a:stretch>
                       <a:fillRect/>
                     </a:stretch>
@@ -751,7 +751,7 @@
                     <pic:cNvPicPr/>
                   </pic:nvPicPr>
                   <pic:blipFill>
-                    <a:blip r:embed="rId13"/>
+                    <a:blip r:embed="rId14"/>
                     <a:stretch>
                       <a:fillRect/>
                     </a:stretch>
@@ -832,7 +832,7 @@
                     <pic:cNvPicPr/>
                   </pic:nvPicPr>
                   <pic:blipFill>
-                    <a:blip r:embed="rId14"/>
+                    <a:blip r:embed="rId15"/>
                     <a:stretch>
                       <a:fillRect/>
                     </a:stretch>
@@ -912,7 +912,7 @@
                     <pic:cNvPicPr/>
                   </pic:nvPicPr>
                   <pic:blipFill>
-                    <a:blip r:embed="rId15"/>
+                    <a:blip r:embed="rId16"/>
                     <a:stretch>
                       <a:fillRect/>
                     </a:stretch>
@@ -985,7 +985,7 @@
                     <pic:cNvPicPr/>
                   </pic:nvPicPr>
                   <pic:blipFill>
-                    <a:blip r:embed="rId16"/>
+                    <a:blip r:embed="rId17"/>
                     <a:stretch>
                       <a:fillRect/>
                     </a:stretch>
@@ -1065,7 +1065,7 @@
                     <pic:cNvPicPr/>
                   </pic:nvPicPr>
                   <pic:blipFill>
-                    <a:blip r:embed="rId17"/>
+                    <a:blip r:embed="rId18"/>
                     <a:stretch>
                       <a:fillRect/>
                     </a:stretch>
@@ -1138,7 +1138,7 @@
                     <pic:cNvPicPr/>
                   </pic:nvPicPr>
                   <pic:blipFill>
-                    <a:blip r:embed="rId18"/>
+                    <a:blip r:embed="rId19"/>
                     <a:stretch>
                       <a:fillRect/>
                     </a:stretch>
@@ -1210,7 +1210,7 @@
                     <pic:cNvPicPr/>
                   </pic:nvPicPr>
                   <pic:blipFill>
-                    <a:blip r:embed="rId19"/>
+                    <a:blip r:embed="rId20"/>
                     <a:stretch>
                       <a:fillRect/>
                     </a:stretch>
@@ -1258,6 +1258,7 @@
         <w:rPr>
           <w:b/>
           <w:bCs/>
+          <w:noProof/>
         </w:rPr>
         <w:drawing>
           <wp:inline distT="0" distB="0" distL="0" distR="0" wp14:anchorId="1C64B4C6" wp14:editId="2AB7D000">
@@ -1275,7 +1276,7 @@
                     <pic:cNvPicPr/>
                   </pic:nvPicPr>
                   <pic:blipFill>
-                    <a:blip r:embed="rId20"/>
+                    <a:blip r:embed="rId21"/>
                     <a:stretch>
                       <a:fillRect/>
                     </a:stretch>
@@ -1330,6 +1331,7 @@
         <w:rPr>
           <w:b/>
           <w:bCs/>
+          <w:noProof/>
         </w:rPr>
         <w:drawing>
           <wp:inline distT="0" distB="0" distL="0" distR="0" wp14:anchorId="0809BED4" wp14:editId="06B96A5C">
@@ -1347,7 +1349,7 @@
                     <pic:cNvPicPr/>
                   </pic:nvPicPr>
                   <pic:blipFill>
-                    <a:blip r:embed="rId21"/>
+                    <a:blip r:embed="rId22"/>
                     <a:stretch>
                       <a:fillRect/>
                     </a:stretch>
@@ -1379,6 +1381,7 @@
         <w:rPr>
           <w:b/>
           <w:bCs/>
+          <w:noProof/>
         </w:rPr>
         <w:lastRenderedPageBreak/>
         <w:drawing>
@@ -1397,7 +1400,7 @@
                     <pic:cNvPicPr/>
                   </pic:nvPicPr>
                   <pic:blipFill>
-                    <a:blip r:embed="rId22"/>
+                    <a:blip r:embed="rId23"/>
                     <a:stretch>
                       <a:fillRect/>
                     </a:stretch>
@@ -1477,7 +1480,7 @@
                     <pic:cNvPicPr/>
                   </pic:nvPicPr>
                   <pic:blipFill>
-                    <a:blip r:embed="rId23"/>
+                    <a:blip r:embed="rId24"/>
                     <a:stretch>
                       <a:fillRect/>
                     </a:stretch>
@@ -1583,7 +1586,7 @@
                     <pic:cNvPicPr/>
                   </pic:nvPicPr>
                   <pic:blipFill>
-                    <a:blip r:embed="rId24"/>
+                    <a:blip r:embed="rId25"/>
                     <a:stretch>
                       <a:fillRect/>
                     </a:stretch>
@@ -1664,7 +1667,7 @@
                     <pic:cNvPicPr/>
                   </pic:nvPicPr>
                   <pic:blipFill>
-                    <a:blip r:embed="rId25"/>
+                    <a:blip r:embed="rId26"/>
                     <a:stretch>
                       <a:fillRect/>
                     </a:stretch>
@@ -1744,7 +1747,7 @@
                     <pic:cNvPicPr/>
                   </pic:nvPicPr>
                   <pic:blipFill>
-                    <a:blip r:embed="rId26"/>
+                    <a:blip r:embed="rId27"/>
                     <a:stretch>
                       <a:fillRect/>
                     </a:stretch>
@@ -1817,7 +1820,7 @@
                     <pic:cNvPicPr/>
                   </pic:nvPicPr>
                   <pic:blipFill>
-                    <a:blip r:embed="rId27"/>
+                    <a:blip r:embed="rId28"/>
                     <a:stretch>
                       <a:fillRect/>
                     </a:stretch>
@@ -1889,7 +1892,7 @@
                     <pic:cNvPicPr/>
                   </pic:nvPicPr>
                   <pic:blipFill>
-                    <a:blip r:embed="rId28"/>
+                    <a:blip r:embed="rId29"/>
                     <a:stretch>
                       <a:fillRect/>
                     </a:stretch>
@@ -1955,7 +1958,7 @@
                     <pic:cNvPicPr/>
                   </pic:nvPicPr>
                   <pic:blipFill>
-                    <a:blip r:embed="rId29"/>
+                    <a:blip r:embed="rId30"/>
                     <a:stretch>
                       <a:fillRect/>
                     </a:stretch>
@@ -2090,71 +2093,6 @@
                 <pic:pic xmlns:pic="http://schemas.openxmlformats.org/drawingml/2006/picture">
                   <pic:nvPicPr>
                     <pic:cNvPr id="666324989" name=""/>
-                    <pic:cNvPicPr/>
-                  </pic:nvPicPr>
-                  <pic:blipFill>
-                    <a:blip r:embed="rId30"/>
-                    <a:stretch>
-                      <a:fillRect/>
-                    </a:stretch>
-                  </pic:blipFill>
-                  <pic:spPr>
-                    <a:xfrm>
-                      <a:off x="0" y="0"/>
-                      <a:ext cx="5943600" cy="2982595"/>
-                    </a:xfrm>
-                    <a:prstGeom prst="rect">
-                      <a:avLst/>
-                    </a:prstGeom>
-                  </pic:spPr>
-                </pic:pic>
-              </a:graphicData>
-            </a:graphic>
-          </wp:inline>
-        </w:drawing>
-      </w:r>
-    </w:p>
-    <w:p>
-      <w:pPr>
-        <w:rPr>
-          <w:b/>
-          <w:bCs/>
-        </w:rPr>
-      </w:pPr>
-      <w:r>
-        <w:rPr>
-          <w:b/>
-          <w:bCs/>
-        </w:rPr>
-        <w:t>test-03-delete-book</w:t>
-      </w:r>
-    </w:p>
-    <w:p>
-      <w:pPr>
-        <w:rPr>
-          <w:b/>
-          <w:bCs/>
-        </w:rPr>
-      </w:pPr>
-      <w:r>
-        <w:rPr>
-          <w:b/>
-          <w:bCs/>
-          <w:noProof/>
-        </w:rPr>
-        <w:drawing>
-          <wp:inline distT="0" distB="0" distL="0" distR="0" wp14:anchorId="3ED25C07" wp14:editId="28CF9583">
-            <wp:extent cx="5943600" cy="2982595"/>
-            <wp:effectExtent l="0" t="0" r="0" b="8255"/>
-            <wp:docPr id="1053385885" name="Picture 1"/>
-            <wp:cNvGraphicFramePr>
-              <a:graphicFrameLocks xmlns:a="http://schemas.openxmlformats.org/drawingml/2006/main" noChangeAspect="1"/>
-            </wp:cNvGraphicFramePr>
-            <a:graphic xmlns:a="http://schemas.openxmlformats.org/drawingml/2006/main">
-              <a:graphicData uri="http://schemas.openxmlformats.org/drawingml/2006/picture">
-                <pic:pic xmlns:pic="http://schemas.openxmlformats.org/drawingml/2006/picture">
-                  <pic:nvPicPr>
-                    <pic:cNvPr id="1053385885" name=""/>
                     <pic:cNvPicPr/>
                   </pic:nvPicPr>
                   <pic:blipFill>
@@ -2186,6 +2124,71 @@
           <w:bCs/>
         </w:rPr>
       </w:pPr>
+      <w:r>
+        <w:rPr>
+          <w:b/>
+          <w:bCs/>
+        </w:rPr>
+        <w:t>test-03-delete-book</w:t>
+      </w:r>
+    </w:p>
+    <w:p>
+      <w:pPr>
+        <w:rPr>
+          <w:b/>
+          <w:bCs/>
+        </w:rPr>
+      </w:pPr>
+      <w:r>
+        <w:rPr>
+          <w:b/>
+          <w:bCs/>
+          <w:noProof/>
+        </w:rPr>
+        <w:drawing>
+          <wp:inline distT="0" distB="0" distL="0" distR="0" wp14:anchorId="3ED25C07" wp14:editId="28CF9583">
+            <wp:extent cx="5943600" cy="2982595"/>
+            <wp:effectExtent l="0" t="0" r="0" b="8255"/>
+            <wp:docPr id="1053385885" name="Picture 1"/>
+            <wp:cNvGraphicFramePr>
+              <a:graphicFrameLocks xmlns:a="http://schemas.openxmlformats.org/drawingml/2006/main" noChangeAspect="1"/>
+            </wp:cNvGraphicFramePr>
+            <a:graphic xmlns:a="http://schemas.openxmlformats.org/drawingml/2006/main">
+              <a:graphicData uri="http://schemas.openxmlformats.org/drawingml/2006/picture">
+                <pic:pic xmlns:pic="http://schemas.openxmlformats.org/drawingml/2006/picture">
+                  <pic:nvPicPr>
+                    <pic:cNvPr id="1053385885" name=""/>
+                    <pic:cNvPicPr/>
+                  </pic:nvPicPr>
+                  <pic:blipFill>
+                    <a:blip r:embed="rId32"/>
+                    <a:stretch>
+                      <a:fillRect/>
+                    </a:stretch>
+                  </pic:blipFill>
+                  <pic:spPr>
+                    <a:xfrm>
+                      <a:off x="0" y="0"/>
+                      <a:ext cx="5943600" cy="2982595"/>
+                    </a:xfrm>
+                    <a:prstGeom prst="rect">
+                      <a:avLst/>
+                    </a:prstGeom>
+                  </pic:spPr>
+                </pic:pic>
+              </a:graphicData>
+            </a:graphic>
+          </wp:inline>
+        </w:drawing>
+      </w:r>
+    </w:p>
+    <w:p>
+      <w:pPr>
+        <w:rPr>
+          <w:b/>
+          <w:bCs/>
+        </w:rPr>
+      </w:pPr>
     </w:p>
     <w:p>
       <w:pPr>
@@ -2256,7 +2259,7 @@
                     <pic:cNvPicPr/>
                   </pic:nvPicPr>
                   <pic:blipFill>
-                    <a:blip r:embed="rId32"/>
+                    <a:blip r:embed="rId33"/>
                     <a:stretch>
                       <a:fillRect/>
                     </a:stretch>
@@ -2343,7 +2346,7 @@
                     <pic:cNvPicPr/>
                   </pic:nvPicPr>
                   <pic:blipFill>
-                    <a:blip r:embed="rId33"/>
+                    <a:blip r:embed="rId34"/>
                     <a:stretch>
                       <a:fillRect/>
                     </a:stretch>
@@ -2407,7 +2410,7 @@
                     <pic:cNvPicPr/>
                   </pic:nvPicPr>
                   <pic:blipFill>
-                    <a:blip r:embed="rId34"/>
+                    <a:blip r:embed="rId35"/>
                     <a:stretch>
                       <a:fillRect/>
                     </a:stretch>
@@ -2496,7 +2499,7 @@
                     <pic:cNvPicPr/>
                   </pic:nvPicPr>
                   <pic:blipFill>
-                    <a:blip r:embed="rId35"/>
+                    <a:blip r:embed="rId36"/>
                     <a:stretch>
                       <a:fillRect/>
                     </a:stretch>
@@ -2567,79 +2570,6 @@
                 <pic:pic xmlns:pic="http://schemas.openxmlformats.org/drawingml/2006/picture">
                   <pic:nvPicPr>
                     <pic:cNvPr id="1852975833" name=""/>
-                    <pic:cNvPicPr/>
-                  </pic:nvPicPr>
-                  <pic:blipFill>
-                    <a:blip r:embed="rId36"/>
-                    <a:stretch>
-                      <a:fillRect/>
-                    </a:stretch>
-                  </pic:blipFill>
-                  <pic:spPr>
-                    <a:xfrm>
-                      <a:off x="0" y="0"/>
-                      <a:ext cx="5943600" cy="3013710"/>
-                    </a:xfrm>
-                    <a:prstGeom prst="rect">
-                      <a:avLst/>
-                    </a:prstGeom>
-                  </pic:spPr>
-                </pic:pic>
-              </a:graphicData>
-            </a:graphic>
-          </wp:inline>
-        </w:drawing>
-      </w:r>
-    </w:p>
-    <w:p>
-      <w:pPr>
-        <w:rPr>
-          <w:b/>
-          <w:bCs/>
-        </w:rPr>
-      </w:pPr>
-    </w:p>
-    <w:p>
-      <w:pPr>
-        <w:rPr>
-          <w:b/>
-          <w:bCs/>
-        </w:rPr>
-      </w:pPr>
-      <w:r>
-        <w:rPr>
-          <w:b/>
-          <w:bCs/>
-        </w:rPr>
-        <w:t>test-09-borrow-rfid-recognized</w:t>
-      </w:r>
-    </w:p>
-    <w:p>
-      <w:pPr>
-        <w:rPr>
-          <w:b/>
-          <w:bCs/>
-        </w:rPr>
-      </w:pPr>
-      <w:r>
-        <w:rPr>
-          <w:b/>
-          <w:bCs/>
-          <w:noProof/>
-        </w:rPr>
-        <w:drawing>
-          <wp:inline distT="0" distB="0" distL="0" distR="0" wp14:anchorId="003F1B2B" wp14:editId="5D5DC928">
-            <wp:extent cx="5943600" cy="3013710"/>
-            <wp:effectExtent l="0" t="0" r="0" b="0"/>
-            <wp:docPr id="162658103" name="Picture 1"/>
-            <wp:cNvGraphicFramePr>
-              <a:graphicFrameLocks xmlns:a="http://schemas.openxmlformats.org/drawingml/2006/main" noChangeAspect="1"/>
-            </wp:cNvGraphicFramePr>
-            <a:graphic xmlns:a="http://schemas.openxmlformats.org/drawingml/2006/main">
-              <a:graphicData uri="http://schemas.openxmlformats.org/drawingml/2006/picture">
-                <pic:pic xmlns:pic="http://schemas.openxmlformats.org/drawingml/2006/picture">
-                  <pic:nvPicPr>
-                    <pic:cNvPr id="162658103" name=""/>
                     <pic:cNvPicPr/>
                   </pic:nvPicPr>
                   <pic:blipFill>
@@ -2679,6 +2609,79 @@
           <w:bCs/>
         </w:rPr>
       </w:pPr>
+      <w:r>
+        <w:rPr>
+          <w:b/>
+          <w:bCs/>
+        </w:rPr>
+        <w:t>test-09-borrow-rfid-recognized</w:t>
+      </w:r>
+    </w:p>
+    <w:p>
+      <w:pPr>
+        <w:rPr>
+          <w:b/>
+          <w:bCs/>
+        </w:rPr>
+      </w:pPr>
+      <w:r>
+        <w:rPr>
+          <w:b/>
+          <w:bCs/>
+          <w:noProof/>
+        </w:rPr>
+        <w:drawing>
+          <wp:inline distT="0" distB="0" distL="0" distR="0" wp14:anchorId="003F1B2B" wp14:editId="5D5DC928">
+            <wp:extent cx="5943600" cy="3013710"/>
+            <wp:effectExtent l="0" t="0" r="0" b="0"/>
+            <wp:docPr id="162658103" name="Picture 1"/>
+            <wp:cNvGraphicFramePr>
+              <a:graphicFrameLocks xmlns:a="http://schemas.openxmlformats.org/drawingml/2006/main" noChangeAspect="1"/>
+            </wp:cNvGraphicFramePr>
+            <a:graphic xmlns:a="http://schemas.openxmlformats.org/drawingml/2006/main">
+              <a:graphicData uri="http://schemas.openxmlformats.org/drawingml/2006/picture">
+                <pic:pic xmlns:pic="http://schemas.openxmlformats.org/drawingml/2006/picture">
+                  <pic:nvPicPr>
+                    <pic:cNvPr id="162658103" name=""/>
+                    <pic:cNvPicPr/>
+                  </pic:nvPicPr>
+                  <pic:blipFill>
+                    <a:blip r:embed="rId38"/>
+                    <a:stretch>
+                      <a:fillRect/>
+                    </a:stretch>
+                  </pic:blipFill>
+                  <pic:spPr>
+                    <a:xfrm>
+                      <a:off x="0" y="0"/>
+                      <a:ext cx="5943600" cy="3013710"/>
+                    </a:xfrm>
+                    <a:prstGeom prst="rect">
+                      <a:avLst/>
+                    </a:prstGeom>
+                  </pic:spPr>
+                </pic:pic>
+              </a:graphicData>
+            </a:graphic>
+          </wp:inline>
+        </w:drawing>
+      </w:r>
+    </w:p>
+    <w:p>
+      <w:pPr>
+        <w:rPr>
+          <w:b/>
+          <w:bCs/>
+        </w:rPr>
+      </w:pPr>
+    </w:p>
+    <w:p>
+      <w:pPr>
+        <w:rPr>
+          <w:b/>
+          <w:bCs/>
+        </w:rPr>
+      </w:pPr>
     </w:p>
     <w:p>
       <w:pPr>
@@ -2733,7 +2736,7 @@
                     <pic:cNvPicPr/>
                   </pic:nvPicPr>
                   <pic:blipFill>
-                    <a:blip r:embed="rId38"/>
+                    <a:blip r:embed="rId39"/>
                     <a:stretch>
                       <a:fillRect/>
                     </a:stretch>
@@ -2806,7 +2809,7 @@
                     <pic:cNvPicPr/>
                   </pic:nvPicPr>
                   <pic:blipFill>
-                    <a:blip r:embed="rId39"/>
+                    <a:blip r:embed="rId40"/>
                     <a:stretch>
                       <a:fillRect/>
                     </a:stretch>
@@ -2896,7 +2899,7 @@
                     <pic:cNvPicPr/>
                   </pic:nvPicPr>
                   <pic:blipFill>
-                    <a:blip r:embed="rId40"/>
+                    <a:blip r:embed="rId41"/>
                     <a:stretch>
                       <a:fillRect/>
                     </a:stretch>
@@ -2969,7 +2972,7 @@
                     <pic:cNvPicPr/>
                   </pic:nvPicPr>
                   <pic:blipFill>
-                    <a:blip r:embed="rId41"/>
+                    <a:blip r:embed="rId42"/>
                     <a:stretch>
                       <a:fillRect/>
                     </a:stretch>
@@ -3059,7 +3062,7 @@
                     <pic:cNvPicPr/>
                   </pic:nvPicPr>
                   <pic:blipFill>
-                    <a:blip r:embed="rId42"/>
+                    <a:blip r:embed="rId43"/>
                     <a:stretch>
                       <a:fillRect/>
                     </a:stretch>
@@ -3080,6 +3083,479 @@
         </w:drawing>
       </w:r>
     </w:p>
+    <w:p>
+      <w:pPr>
+        <w:rPr>
+          <w:b/>
+          <w:bCs/>
+        </w:rPr>
+      </w:pPr>
+    </w:p>
+    <w:p>
+      <w:pPr>
+        <w:rPr>
+          <w:b/>
+          <w:bCs/>
+        </w:rPr>
+      </w:pPr>
+      <w:r>
+        <w:rPr>
+          <w:b/>
+          <w:bCs/>
+        </w:rPr>
+        <w:br w:type="page"/>
+      </w:r>
+    </w:p>
+    <w:p>
+      <w:pPr>
+        <w:rPr>
+          <w:b/>
+          <w:bCs/>
+        </w:rPr>
+      </w:pPr>
+      <w:r>
+        <w:rPr>
+          <w:b/>
+          <w:bCs/>
+        </w:rPr>
+        <w:lastRenderedPageBreak/>
+        <w:t>Student Reflection Questions</w:t>
+      </w:r>
+    </w:p>
+    <w:p>
+      <w:pPr>
+        <w:numPr>
+          <w:ilvl w:val="0"/>
+          <w:numId w:val="1"/>
+        </w:numPr>
+        <w:rPr>
+          <w:b/>
+          <w:bCs/>
+        </w:rPr>
+      </w:pPr>
+      <w:r>
+        <w:rPr>
+          <w:b/>
+          <w:bCs/>
+        </w:rPr>
+        <w:t xml:space="preserve">What does </w:t>
+      </w:r>
+      <w:proofErr w:type="spellStart"/>
+      <w:proofErr w:type="gramStart"/>
+      <w:r>
+        <w:rPr>
+          <w:b/>
+          <w:bCs/>
+        </w:rPr>
+        <w:t>apiFetch</w:t>
+      </w:r>
+      <w:proofErr w:type="spellEnd"/>
+      <w:r>
+        <w:rPr>
+          <w:b/>
+          <w:bCs/>
+        </w:rPr>
+        <w:t>(</w:t>
+      </w:r>
+      <w:proofErr w:type="gramEnd"/>
+      <w:r>
+        <w:rPr>
+          <w:b/>
+          <w:bCs/>
+        </w:rPr>
+        <w:t>) do?</w:t>
+      </w:r>
+    </w:p>
+    <w:p>
+      <w:pPr>
+        <w:pStyle w:val="ListParagraph"/>
+        <w:numPr>
+          <w:ilvl w:val="0"/>
+          <w:numId w:val="3"/>
+        </w:numPr>
+        <w:rPr>
+          <w:b/>
+          <w:bCs/>
+        </w:rPr>
+      </w:pPr>
+      <w:r>
+        <w:t xml:space="preserve">It is to prevent repeated code. </w:t>
+      </w:r>
+    </w:p>
+    <w:p>
+      <w:pPr>
+        <w:numPr>
+          <w:ilvl w:val="0"/>
+          <w:numId w:val="1"/>
+        </w:numPr>
+        <w:rPr>
+          <w:b/>
+          <w:bCs/>
+        </w:rPr>
+      </w:pPr>
+      <w:r>
+        <w:rPr>
+          <w:b/>
+          <w:bCs/>
+        </w:rPr>
+        <w:t>Why do we use try/catch around API calls?</w:t>
+      </w:r>
+    </w:p>
+    <w:p>
+      <w:pPr>
+        <w:pStyle w:val="ListParagraph"/>
+        <w:numPr>
+          <w:ilvl w:val="0"/>
+          <w:numId w:val="3"/>
+        </w:numPr>
+        <w:rPr>
+          <w:b/>
+          <w:bCs/>
+        </w:rPr>
+      </w:pPr>
+      <w:r>
+        <w:t>To have a proper error handling block.</w:t>
+      </w:r>
+    </w:p>
+    <w:p>
+      <w:pPr>
+        <w:numPr>
+          <w:ilvl w:val="0"/>
+          <w:numId w:val="1"/>
+        </w:numPr>
+        <w:rPr>
+          <w:b/>
+          <w:bCs/>
+        </w:rPr>
+      </w:pPr>
+      <w:r>
+        <w:rPr>
+          <w:b/>
+          <w:bCs/>
+        </w:rPr>
+        <w:t>What is the difference between POST and PUT?</w:t>
+      </w:r>
+    </w:p>
+    <w:p>
+      <w:pPr>
+        <w:pStyle w:val="ListParagraph"/>
+        <w:numPr>
+          <w:ilvl w:val="0"/>
+          <w:numId w:val="3"/>
+        </w:numPr>
+        <w:rPr>
+          <w:b/>
+          <w:bCs/>
+        </w:rPr>
+      </w:pPr>
+      <w:r>
+        <w:t>POST is to create a new Data, then PUT is to update an existing data.</w:t>
+      </w:r>
+    </w:p>
+    <w:p>
+      <w:pPr>
+        <w:numPr>
+          <w:ilvl w:val="0"/>
+          <w:numId w:val="1"/>
+        </w:numPr>
+        <w:rPr>
+          <w:b/>
+          <w:bCs/>
+        </w:rPr>
+      </w:pPr>
+      <w:r>
+        <w:rPr>
+          <w:b/>
+          <w:bCs/>
+        </w:rPr>
+        <w:t xml:space="preserve">Why does RFID matching use </w:t>
+      </w:r>
+      <w:proofErr w:type="spellStart"/>
+      <w:r>
+        <w:rPr>
+          <w:b/>
+          <w:bCs/>
+        </w:rPr>
+        <w:t>rfidValue</w:t>
+      </w:r>
+      <w:proofErr w:type="spellEnd"/>
+      <w:r>
+        <w:rPr>
+          <w:b/>
+          <w:bCs/>
+        </w:rPr>
+        <w:t xml:space="preserve"> instead of </w:t>
+      </w:r>
+      <w:proofErr w:type="spellStart"/>
+      <w:r>
+        <w:rPr>
+          <w:b/>
+          <w:bCs/>
+        </w:rPr>
+        <w:t>studentId</w:t>
+      </w:r>
+      <w:proofErr w:type="spellEnd"/>
+      <w:r>
+        <w:rPr>
+          <w:b/>
+          <w:bCs/>
+        </w:rPr>
+        <w:t>?</w:t>
+      </w:r>
+    </w:p>
+    <w:p>
+      <w:pPr>
+        <w:pStyle w:val="ListParagraph"/>
+        <w:numPr>
+          <w:ilvl w:val="0"/>
+          <w:numId w:val="3"/>
+        </w:numPr>
+        <w:rPr>
+          <w:b/>
+          <w:bCs/>
+        </w:rPr>
+      </w:pPr>
+      <w:r>
+        <w:t xml:space="preserve">Because the RFID value is saved in </w:t>
+      </w:r>
+      <w:proofErr w:type="spellStart"/>
+      <w:r>
+        <w:t>rfidValue</w:t>
+      </w:r>
+      <w:proofErr w:type="spellEnd"/>
+      <w:r>
+        <w:t xml:space="preserve">. </w:t>
+      </w:r>
+      <w:proofErr w:type="gramStart"/>
+      <w:r>
+        <w:t>Also</w:t>
+      </w:r>
+      <w:proofErr w:type="gramEnd"/>
+      <w:r>
+        <w:t xml:space="preserve"> we cannot use </w:t>
+      </w:r>
+      <w:proofErr w:type="spellStart"/>
+      <w:r>
+        <w:t>studentId</w:t>
+      </w:r>
+      <w:proofErr w:type="spellEnd"/>
+      <w:r>
+        <w:t xml:space="preserve"> to avoid error or same name.</w:t>
+      </w:r>
+    </w:p>
+    <w:p>
+      <w:pPr>
+        <w:numPr>
+          <w:ilvl w:val="0"/>
+          <w:numId w:val="1"/>
+        </w:numPr>
+        <w:rPr>
+          <w:b/>
+          <w:bCs/>
+        </w:rPr>
+      </w:pPr>
+      <w:r>
+        <w:rPr>
+          <w:b/>
+          <w:bCs/>
+        </w:rPr>
+        <w:t>Why do we refresh tables after adding, deleting, borrowing, or returning?</w:t>
+      </w:r>
+    </w:p>
+    <w:p>
+      <w:pPr>
+        <w:pStyle w:val="ListParagraph"/>
+        <w:numPr>
+          <w:ilvl w:val="0"/>
+          <w:numId w:val="3"/>
+        </w:numPr>
+        <w:rPr>
+          <w:b/>
+          <w:bCs/>
+        </w:rPr>
+      </w:pPr>
+      <w:r>
+        <w:t>To know if the data are saved on the API.</w:t>
+      </w:r>
+    </w:p>
+    <w:p>
+      <w:pPr>
+        <w:numPr>
+          <w:ilvl w:val="0"/>
+          <w:numId w:val="1"/>
+        </w:numPr>
+        <w:rPr>
+          <w:b/>
+          <w:bCs/>
+        </w:rPr>
+      </w:pPr>
+      <w:r>
+        <w:rPr>
+          <w:b/>
+          <w:bCs/>
+        </w:rPr>
+        <w:t>Why does the Return dropdown use borrow record ID instead of book ID?</w:t>
+      </w:r>
+    </w:p>
+    <w:p>
+      <w:pPr>
+        <w:pStyle w:val="ListParagraph"/>
+        <w:numPr>
+          <w:ilvl w:val="0"/>
+          <w:numId w:val="3"/>
+        </w:numPr>
+        <w:rPr>
+          <w:b/>
+          <w:bCs/>
+        </w:rPr>
+      </w:pPr>
+      <w:r>
+        <w:t>Because record ID is different to book ID. Book ID is for the book itself, then record ID is for the borrow lists.</w:t>
+      </w:r>
+    </w:p>
+    <w:p>
+      <w:pPr>
+        <w:numPr>
+          <w:ilvl w:val="0"/>
+          <w:numId w:val="1"/>
+        </w:numPr>
+        <w:rPr>
+          <w:b/>
+          <w:bCs/>
+        </w:rPr>
+      </w:pPr>
+      <w:r>
+        <w:rPr>
+          <w:b/>
+          <w:bCs/>
+        </w:rPr>
+        <w:t>What happens if the same event listener is added to a form twice?</w:t>
+      </w:r>
+    </w:p>
+    <w:p>
+      <w:pPr>
+        <w:pStyle w:val="ListParagraph"/>
+        <w:numPr>
+          <w:ilvl w:val="0"/>
+          <w:numId w:val="3"/>
+        </w:numPr>
+      </w:pPr>
+      <w:r>
+        <w:t>A repeated event listener sends two requests for one click.</w:t>
+      </w:r>
+    </w:p>
+    <w:p>
+      <w:pPr>
+        <w:numPr>
+          <w:ilvl w:val="0"/>
+          <w:numId w:val="1"/>
+        </w:numPr>
+        <w:rPr>
+          <w:b/>
+          <w:bCs/>
+        </w:rPr>
+      </w:pPr>
+      <w:r>
+        <w:rPr>
+          <w:b/>
+          <w:bCs/>
+        </w:rPr>
+        <w:t>Why must the page-load code be at the bottom of the file?</w:t>
+      </w:r>
+    </w:p>
+    <w:p>
+      <w:pPr>
+        <w:pStyle w:val="ListParagraph"/>
+        <w:numPr>
+          <w:ilvl w:val="0"/>
+          <w:numId w:val="3"/>
+        </w:numPr>
+        <w:rPr>
+          <w:b/>
+          <w:bCs/>
+        </w:rPr>
+      </w:pPr>
+      <w:r>
+        <w:t xml:space="preserve">If it is placed at the top of the file. The data will not </w:t>
+      </w:r>
+      <w:proofErr w:type="gramStart"/>
+      <w:r>
+        <w:t>shown</w:t>
+      </w:r>
+      <w:proofErr w:type="gramEnd"/>
+      <w:r>
+        <w:t xml:space="preserve"> and read. </w:t>
+      </w:r>
+      <w:proofErr w:type="gramStart"/>
+      <w:r>
+        <w:t>So</w:t>
+      </w:r>
+      <w:proofErr w:type="gramEnd"/>
+      <w:r>
+        <w:t xml:space="preserve"> we will place it at the bottom.</w:t>
+      </w:r>
+    </w:p>
+    <w:p>
+      <w:pPr>
+        <w:numPr>
+          <w:ilvl w:val="0"/>
+          <w:numId w:val="1"/>
+        </w:numPr>
+        <w:rPr>
+          <w:b/>
+          <w:bCs/>
+        </w:rPr>
+      </w:pPr>
+      <w:r>
+        <w:rPr>
+          <w:b/>
+          <w:bCs/>
+        </w:rPr>
+        <w:t xml:space="preserve">Why does an RFID reader need </w:t>
+      </w:r>
+      <w:proofErr w:type="spellStart"/>
+      <w:proofErr w:type="gramStart"/>
+      <w:r>
+        <w:rPr>
+          <w:b/>
+          <w:bCs/>
+        </w:rPr>
+        <w:t>e.preventDefault</w:t>
+      </w:r>
+      <w:proofErr w:type="spellEnd"/>
+      <w:proofErr w:type="gramEnd"/>
+      <w:r>
+        <w:rPr>
+          <w:b/>
+          <w:bCs/>
+        </w:rPr>
+        <w:t>() on the Enter key?</w:t>
+      </w:r>
+    </w:p>
+    <w:p>
+      <w:pPr>
+        <w:pStyle w:val="ListParagraph"/>
+        <w:numPr>
+          <w:ilvl w:val="0"/>
+          <w:numId w:val="3"/>
+        </w:numPr>
+        <w:rPr>
+          <w:b/>
+          <w:bCs/>
+        </w:rPr>
+      </w:pPr>
+      <w:r>
+        <w:t>To prevent the form is not submitted by accident.</w:t>
+      </w:r>
+    </w:p>
+    <w:p>
+      <w:pPr>
+        <w:rPr>
+          <w:b/>
+          <w:bCs/>
+        </w:rPr>
+      </w:pPr>
+    </w:p>
     <w:sectPr>
       <w:pgSz w:w="12240" w:h="15840"/>
       <w:pgMar w:top="1440" w:right="1440" w:bottom="1440" w:left="1440" w:header="720" w:footer="720" w:gutter="0"/>
@@ -3088,6 +3564,357 @@
     </w:sectPr>
   </w:body>
 </w:document>
+</file>
+
+<file path=word/numbering.xml><?xml version="1.0" encoding="utf-8"?>
+<w:numbering xmlns:wpc="http://schemas.microsoft.com/office/word/2010/wordprocessingCanvas" xmlns:cx="http://schemas.microsoft.com/office/drawing/2014/chartex" xmlns:cx1="http://schemas.microsoft.com/office/drawing/2015/9/8/chartex" xmlns:cx2="http://schemas.microsoft.com/office/drawing/2015/10/21/chartex" xmlns:cx3="http://schemas.microsoft.com/office/drawing/2016/5/9/chartex" xmlns:cx4="http://schemas.microsoft.com/office/drawing/2016/5/10/chartex" xmlns:cx5="http://schemas.microsoft.com/office/drawing/2016/5/11/chartex" xmlns:cx6="http://schemas.microsoft.com/office/drawing/2016/5/12/chartex" xmlns:cx7="http://schemas.microsoft.com/office/drawing/2016/5/13/chartex" xmlns:cx8="http://schemas.microsoft.com/office/drawing/2016/5/14/chartex" xmlns:mc="http://schemas.openxmlformats.org/markup-compatibility/2006" xmlns:aink="http://schemas.microsoft.com/office/drawing/2016/ink" xmlns:am3d="http://schemas.microsoft.com/office/drawing/2017/model3d" xmlns:o="urn:schemas-microsoft-com:office:office" xmlns:oel="http://schemas.microsoft.com/office/2019/extlst" xmlns:r="http://schemas.openxmlformats.org/officeDocument/2006/relationships" xmlns:m="http://schemas.openxmlformats.org/officeDocument/2006/math" xmlns:v="urn:schemas-microsoft-com:vml" xmlns:wp14="http://schemas.microsoft.com/office/word/2010/wordprocessingDrawing" xmlns:wp="http://schemas.openxmlformats.org/drawingml/2006/wordprocessingDrawing" xmlns:w10="urn:schemas-microsoft-com:office:word" xmlns:w="http://schemas.openxmlformats.org/wordprocessingml/2006/main" xmlns:w14="http://schemas.microsoft.com/office/word/2010/wordml" xmlns:w15="http://schemas.microsoft.com/office/word/2012/wordml" xmlns:w16cex="http://schemas.microsoft.com/office/word/2018/wordml/cex" xmlns:w16cid="http://schemas.microsoft.com/office/word/2016/wordml/cid" xmlns:w16="http://schemas.microsoft.com/office/word/2018/wordml" xmlns:w16du="http://schemas.microsoft.com/office/word/2023/wordml/word16du" xmlns:w16sdtdh="http://schemas.microsoft.com/office/word/2020/wordml/sdtdatahash" xmlns:w16sdtfl="http://schemas.microsoft.com/office/word/2024/wordml/sdtformatlock" xmlns:w16se="http://schemas.microsoft.com/office/word/2015/wordml/symex" xmlns:wpg="http://schemas.microsoft.com/office/word/2010/wordprocessingGroup" xmlns:wpi="http://schemas.microsoft.com/office/word/2010/wordprocessingInk" xmlns:wne="http://schemas.microsoft.com/office/word/2006/wordml" xmlns:wps="http://schemas.microsoft.com/office/word/2010/wordprocessingShape" mc:Ignorable="w14 w15 w16se w16cid w16 w16cex w16sdtdh w16sdtfl w16du wp14">
+  <w:abstractNum w:abstractNumId="0" w15:restartNumberingAfterBreak="0">
+    <w:nsid w:val="226C52D2"/>
+    <w:multiLevelType w:val="hybridMultilevel"/>
+    <w:tmpl w:val="3F621CA6"/>
+    <w:lvl w:ilvl="0" w:tplc="D40087FC">
+      <w:numFmt w:val="bullet"/>
+      <w:lvlText w:val="-"/>
+      <w:lvlJc w:val="left"/>
+      <w:pPr>
+        <w:ind w:left="720" w:hanging="360"/>
+      </w:pPr>
+      <w:rPr>
+        <w:rFonts w:ascii="Calibri" w:eastAsiaTheme="minorHAnsi" w:hAnsi="Calibri" w:cs="Calibri" w:hint="default"/>
+      </w:rPr>
+    </w:lvl>
+    <w:lvl w:ilvl="1" w:tplc="04090003" w:tentative="1">
+      <w:start w:val="1"/>
+      <w:numFmt w:val="bullet"/>
+      <w:lvlText w:val="o"/>
+      <w:lvlJc w:val="left"/>
+      <w:pPr>
+        <w:ind w:left="1440" w:hanging="360"/>
+      </w:pPr>
+      <w:rPr>
+        <w:rFonts w:ascii="Courier New" w:hAnsi="Courier New" w:cs="Courier New" w:hint="default"/>
+      </w:rPr>
+    </w:lvl>
+    <w:lvl w:ilvl="2" w:tplc="04090005" w:tentative="1">
+      <w:start w:val="1"/>
+      <w:numFmt w:val="bullet"/>
+      <w:lvlText w:val=""/>
+      <w:lvlJc w:val="left"/>
+      <w:pPr>
+        <w:ind w:left="2160" w:hanging="360"/>
+      </w:pPr>
+      <w:rPr>
+        <w:rFonts w:ascii="Wingdings" w:hAnsi="Wingdings" w:hint="default"/>
+      </w:rPr>
+    </w:lvl>
+    <w:lvl w:ilvl="3" w:tplc="04090001" w:tentative="1">
+      <w:start w:val="1"/>
+      <w:numFmt w:val="bullet"/>
+      <w:lvlText w:val=""/>
+      <w:lvlJc w:val="left"/>
+      <w:pPr>
+        <w:ind w:left="2880" w:hanging="360"/>
+      </w:pPr>
+      <w:rPr>
+        <w:rFonts w:ascii="Symbol" w:hAnsi="Symbol" w:hint="default"/>
+      </w:rPr>
+    </w:lvl>
+    <w:lvl w:ilvl="4" w:tplc="04090003" w:tentative="1">
+      <w:start w:val="1"/>
+      <w:numFmt w:val="bullet"/>
+      <w:lvlText w:val="o"/>
+      <w:lvlJc w:val="left"/>
+      <w:pPr>
+        <w:ind w:left="3600" w:hanging="360"/>
+      </w:pPr>
+      <w:rPr>
+        <w:rFonts w:ascii="Courier New" w:hAnsi="Courier New" w:cs="Courier New" w:hint="default"/>
+      </w:rPr>
+    </w:lvl>
+    <w:lvl w:ilvl="5" w:tplc="04090005" w:tentative="1">
+      <w:start w:val="1"/>
+      <w:numFmt w:val="bullet"/>
+      <w:lvlText w:val=""/>
+      <w:lvlJc w:val="left"/>
+      <w:pPr>
+        <w:ind w:left="4320" w:hanging="360"/>
+      </w:pPr>
+      <w:rPr>
+        <w:rFonts w:ascii="Wingdings" w:hAnsi="Wingdings" w:hint="default"/>
+      </w:rPr>
+    </w:lvl>
+    <w:lvl w:ilvl="6" w:tplc="04090001" w:tentative="1">
+      <w:start w:val="1"/>
+      <w:numFmt w:val="bullet"/>
+      <w:lvlText w:val=""/>
+      <w:lvlJc w:val="left"/>
+      <w:pPr>
+        <w:ind w:left="5040" w:hanging="360"/>
+      </w:pPr>
+      <w:rPr>
+        <w:rFonts w:ascii="Symbol" w:hAnsi="Symbol" w:hint="default"/>
+      </w:rPr>
+    </w:lvl>
+    <w:lvl w:ilvl="7" w:tplc="04090003" w:tentative="1">
+      <w:start w:val="1"/>
+      <w:numFmt w:val="bullet"/>
+      <w:lvlText w:val="o"/>
+      <w:lvlJc w:val="left"/>
+      <w:pPr>
+        <w:ind w:left="5760" w:hanging="360"/>
+      </w:pPr>
+      <w:rPr>
+        <w:rFonts w:ascii="Courier New" w:hAnsi="Courier New" w:cs="Courier New" w:hint="default"/>
+      </w:rPr>
+    </w:lvl>
+    <w:lvl w:ilvl="8" w:tplc="04090005" w:tentative="1">
+      <w:start w:val="1"/>
+      <w:numFmt w:val="bullet"/>
+      <w:lvlText w:val=""/>
+      <w:lvlJc w:val="left"/>
+      <w:pPr>
+        <w:ind w:left="6480" w:hanging="360"/>
+      </w:pPr>
+      <w:rPr>
+        <w:rFonts w:ascii="Wingdings" w:hAnsi="Wingdings" w:hint="default"/>
+      </w:rPr>
+    </w:lvl>
+  </w:abstractNum>
+  <w:abstractNum w:abstractNumId="1" w15:restartNumberingAfterBreak="0">
+    <w:nsid w:val="6F753B39"/>
+    <w:multiLevelType w:val="hybridMultilevel"/>
+    <w:tmpl w:val="5B1835DC"/>
+    <w:lvl w:ilvl="0" w:tplc="A27298D2">
+      <w:numFmt w:val="bullet"/>
+      <w:lvlText w:val="-"/>
+      <w:lvlJc w:val="left"/>
+      <w:pPr>
+        <w:ind w:left="720" w:hanging="360"/>
+      </w:pPr>
+      <w:rPr>
+        <w:rFonts w:ascii="Calibri" w:eastAsiaTheme="minorHAnsi" w:hAnsi="Calibri" w:cs="Calibri" w:hint="default"/>
+      </w:rPr>
+    </w:lvl>
+    <w:lvl w:ilvl="1" w:tplc="04090003" w:tentative="1">
+      <w:start w:val="1"/>
+      <w:numFmt w:val="bullet"/>
+      <w:lvlText w:val="o"/>
+      <w:lvlJc w:val="left"/>
+      <w:pPr>
+        <w:ind w:left="1440" w:hanging="360"/>
+      </w:pPr>
+      <w:rPr>
+        <w:rFonts w:ascii="Courier New" w:hAnsi="Courier New" w:cs="Courier New" w:hint="default"/>
+      </w:rPr>
+    </w:lvl>
+    <w:lvl w:ilvl="2" w:tplc="04090005" w:tentative="1">
+      <w:start w:val="1"/>
+      <w:numFmt w:val="bullet"/>
+      <w:lvlText w:val=""/>
+      <w:lvlJc w:val="left"/>
+      <w:pPr>
+        <w:ind w:left="2160" w:hanging="360"/>
+      </w:pPr>
+      <w:rPr>
+        <w:rFonts w:ascii="Wingdings" w:hAnsi="Wingdings" w:hint="default"/>
+      </w:rPr>
+    </w:lvl>
+    <w:lvl w:ilvl="3" w:tplc="04090001" w:tentative="1">
+      <w:start w:val="1"/>
+      <w:numFmt w:val="bullet"/>
+      <w:lvlText w:val=""/>
+      <w:lvlJc w:val="left"/>
+      <w:pPr>
+        <w:ind w:left="2880" w:hanging="360"/>
+      </w:pPr>
+      <w:rPr>
+        <w:rFonts w:ascii="Symbol" w:hAnsi="Symbol" w:hint="default"/>
+      </w:rPr>
+    </w:lvl>
+    <w:lvl w:ilvl="4" w:tplc="04090003" w:tentative="1">
+      <w:start w:val="1"/>
+      <w:numFmt w:val="bullet"/>
+      <w:lvlText w:val="o"/>
+      <w:lvlJc w:val="left"/>
+      <w:pPr>
+        <w:ind w:left="3600" w:hanging="360"/>
+      </w:pPr>
+      <w:rPr>
+        <w:rFonts w:ascii="Courier New" w:hAnsi="Courier New" w:cs="Courier New" w:hint="default"/>
+      </w:rPr>
+    </w:lvl>
+    <w:lvl w:ilvl="5" w:tplc="04090005" w:tentative="1">
+      <w:start w:val="1"/>
+      <w:numFmt w:val="bullet"/>
+      <w:lvlText w:val=""/>
+      <w:lvlJc w:val="left"/>
+      <w:pPr>
+        <w:ind w:left="4320" w:hanging="360"/>
+      </w:pPr>
+      <w:rPr>
+        <w:rFonts w:ascii="Wingdings" w:hAnsi="Wingdings" w:hint="default"/>
+      </w:rPr>
+    </w:lvl>
+    <w:lvl w:ilvl="6" w:tplc="04090001" w:tentative="1">
+      <w:start w:val="1"/>
+      <w:numFmt w:val="bullet"/>
+      <w:lvlText w:val=""/>
+      <w:lvlJc w:val="left"/>
+      <w:pPr>
+        <w:ind w:left="5040" w:hanging="360"/>
+      </w:pPr>
+      <w:rPr>
+        <w:rFonts w:ascii="Symbol" w:hAnsi="Symbol" w:hint="default"/>
+      </w:rPr>
+    </w:lvl>
+    <w:lvl w:ilvl="7" w:tplc="04090003" w:tentative="1">
+      <w:start w:val="1"/>
+      <w:numFmt w:val="bullet"/>
+      <w:lvlText w:val="o"/>
+      <w:lvlJc w:val="left"/>
+      <w:pPr>
+        <w:ind w:left="5760" w:hanging="360"/>
+      </w:pPr>
+      <w:rPr>
+        <w:rFonts w:ascii="Courier New" w:hAnsi="Courier New" w:cs="Courier New" w:hint="default"/>
+      </w:rPr>
+    </w:lvl>
+    <w:lvl w:ilvl="8" w:tplc="04090005" w:tentative="1">
+      <w:start w:val="1"/>
+      <w:numFmt w:val="bullet"/>
+      <w:lvlText w:val=""/>
+      <w:lvlJc w:val="left"/>
+      <w:pPr>
+        <w:ind w:left="6480" w:hanging="360"/>
+      </w:pPr>
+      <w:rPr>
+        <w:rFonts w:ascii="Wingdings" w:hAnsi="Wingdings" w:hint="default"/>
+      </w:rPr>
+    </w:lvl>
+  </w:abstractNum>
+  <w:abstractNum w:abstractNumId="2" w15:restartNumberingAfterBreak="0">
+    <w:nsid w:val="7CA47A8D"/>
+    <w:multiLevelType w:val="multilevel"/>
+    <w:tmpl w:val="A5CE7FC4"/>
+    <w:lvl w:ilvl="0">
+      <w:start w:val="1"/>
+      <w:numFmt w:val="decimal"/>
+      <w:lvlText w:val="%1."/>
+      <w:lvlJc w:val="left"/>
+      <w:pPr>
+        <w:tabs>
+          <w:tab w:val="num" w:pos="720"/>
+        </w:tabs>
+        <w:ind w:left="720" w:hanging="360"/>
+      </w:pPr>
+    </w:lvl>
+    <w:lvl w:ilvl="1" w:tentative="1">
+      <w:start w:val="1"/>
+      <w:numFmt w:val="decimal"/>
+      <w:lvlText w:val="%2."/>
+      <w:lvlJc w:val="left"/>
+      <w:pPr>
+        <w:tabs>
+          <w:tab w:val="num" w:pos="1440"/>
+        </w:tabs>
+        <w:ind w:left="1440" w:hanging="360"/>
+      </w:pPr>
+    </w:lvl>
+    <w:lvl w:ilvl="2" w:tentative="1">
+      <w:start w:val="1"/>
+      <w:numFmt w:val="decimal"/>
+      <w:lvlText w:val="%3."/>
+      <w:lvlJc w:val="left"/>
+      <w:pPr>
+        <w:tabs>
+          <w:tab w:val="num" w:pos="2160"/>
+        </w:tabs>
+        <w:ind w:left="2160" w:hanging="360"/>
+      </w:pPr>
+    </w:lvl>
+    <w:lvl w:ilvl="3" w:tentative="1">
+      <w:start w:val="1"/>
+      <w:numFmt w:val="decimal"/>
+      <w:lvlText w:val="%4."/>
+      <w:lvlJc w:val="left"/>
+      <w:pPr>
+        <w:tabs>
+          <w:tab w:val="num" w:pos="2880"/>
+        </w:tabs>
+        <w:ind w:left="2880" w:hanging="360"/>
+      </w:pPr>
+    </w:lvl>
+    <w:lvl w:ilvl="4" w:tentative="1">
+      <w:start w:val="1"/>
+      <w:numFmt w:val="decimal"/>
+      <w:lvlText w:val="%5."/>
+      <w:lvlJc w:val="left"/>
+      <w:pPr>
+        <w:tabs>
+          <w:tab w:val="num" w:pos="3600"/>
+        </w:tabs>
+        <w:ind w:left="3600" w:hanging="360"/>
+      </w:pPr>
+    </w:lvl>
+    <w:lvl w:ilvl="5" w:tentative="1">
+      <w:start w:val="1"/>
+      <w:numFmt w:val="decimal"/>
+      <w:lvlText w:val="%6."/>
+      <w:lvlJc w:val="left"/>
+      <w:pPr>
+        <w:tabs>
+          <w:tab w:val="num" w:pos="4320"/>
+        </w:tabs>
+        <w:ind w:left="4320" w:hanging="360"/>
+      </w:pPr>
+    </w:lvl>
+    <w:lvl w:ilvl="6" w:tentative="1">
+      <w:start w:val="1"/>
+      <w:numFmt w:val="decimal"/>
+      <w:lvlText w:val="%7."/>
+      <w:lvlJc w:val="left"/>
+      <w:pPr>
+        <w:tabs>
+          <w:tab w:val="num" w:pos="5040"/>
+        </w:tabs>
+        <w:ind w:left="5040" w:hanging="360"/>
+      </w:pPr>
+    </w:lvl>
+    <w:lvl w:ilvl="7" w:tentative="1">
+      <w:start w:val="1"/>
+      <w:numFmt w:val="decimal"/>
+      <w:lvlText w:val="%8."/>
+      <w:lvlJc w:val="left"/>
+      <w:pPr>
+        <w:tabs>
+          <w:tab w:val="num" w:pos="5760"/>
+        </w:tabs>
+        <w:ind w:left="5760" w:hanging="360"/>
+      </w:pPr>
+    </w:lvl>
+    <w:lvl w:ilvl="8" w:tentative="1">
+      <w:start w:val="1"/>
+      <w:numFmt w:val="decimal"/>
+      <w:lvlText w:val="%9."/>
+      <w:lvlJc w:val="left"/>
+      <w:pPr>
+        <w:tabs>
+          <w:tab w:val="num" w:pos="6480"/>
+        </w:tabs>
+        <w:ind w:left="6480" w:hanging="360"/>
+      </w:pPr>
+    </w:lvl>
+  </w:abstractNum>
+  <w:num w:numId="1" w16cid:durableId="1939099300">
+    <w:abstractNumId w:val="2"/>
+  </w:num>
+  <w:num w:numId="2" w16cid:durableId="107890578">
+    <w:abstractNumId w:val="0"/>
+  </w:num>
+  <w:num w:numId="3" w16cid:durableId="1904485650">
+    <w:abstractNumId w:val="1"/>
+  </w:num>
+</w:numbering>
 </file>
 
 <file path=word/styles.xml><?xml version="1.0" encoding="utf-8"?>

</xml_diff>